<commit_message>
docs: show system actors as system shapes and make Figure 13 a whole-pipeline state diagram
Database is drawn as a cylinder and AI engines, email and other services
as <<system>> boxes; only people stay as stick-figure actors. Figure 13
now covers the full run: six stages, completion, publishing, failure
and reopen paths. The report text and states table are updated to match.
</commit_message>
<xml_diff>
--- a/docs/report/SpecTwin_Technical_Report.docx
+++ b/docs/report/SpecTwin_Technical_Report.docx
@@ -23107,7 +23107,12 @@
         <w:pStyle w:val="Caption"/>
       </w:pPr>
       <w:r>
-        <w:t xml:space="preserve">Figure 13: State Diagram of a Stage Revision</w:t>
+        <w:t xml:space="preserve">Figure 13: State Diagram of the Generation Pipeline</w:t>
+      </w:r>
+    </w:p>
+    <w:p>
+      <w:r>
+        <w:t xml:space="preserve">The state diagram covers the whole pipeline run. A run starts in the Input stage and moves through the six stages; in each stage the user can edit (saving a new version) and approve (the payload is validated, the run is running while the next stage is generated, and the next stage becomes ready for review). Approving the XML stage completes the run, which is then published. A generation error moves the run to failed, from where it can be retried, and reopening a stage after publishing marks later stages stale until they are re-approved and regenerated.</w:t>
       </w:r>
     </w:p>
     <w:tbl>
@@ -23123,8 +23128,9 @@
         </w:tblBorders>
       </w:tblPr>
       <w:tblGrid>
-        <w:gridCol w:w="2600"/>
-        <w:gridCol w:w="6760"/>
+        <w:gridCol w:w="2200"/>
+        <w:gridCol w:w="1800"/>
+        <w:gridCol w:w="5360"/>
       </w:tblGrid>
       <w:tr>
         <w:trPr>
@@ -23132,7 +23138,7 @@
         </w:trPr>
         <w:tc>
           <w:tcPr>
-            <w:tcW w:type="dxa" w:w="2600"/>
+            <w:tcW w:type="dxa" w:w="2200"/>
             <w:tcBorders>
               <w:top w:val="single" w:color="808080" w:sz="4"/>
               <w:left w:val="single" w:color="808080" w:sz="4"/>
@@ -23163,7 +23169,38 @@
         </w:tc>
         <w:tc>
           <w:tcPr>
-            <w:tcW w:type="dxa" w:w="6760"/>
+            <w:tcW w:type="dxa" w:w="1800"/>
+            <w:tcBorders>
+              <w:top w:val="single" w:color="808080" w:sz="4"/>
+              <w:left w:val="single" w:color="808080" w:sz="4"/>
+              <w:bottom w:val="single" w:color="808080" w:sz="4"/>
+              <w:right w:val="single" w:color="808080" w:sz="4"/>
+            </w:tcBorders>
+            <w:shd w:fill="D9E2F3" w:val="clear"/>
+            <w:tcMar>
+              <w:top w:type="dxa" w:w="60"/>
+              <w:left w:type="dxa" w:w="100"/>
+              <w:bottom w:type="dxa" w:w="60"/>
+              <w:right w:type="dxa" w:w="100"/>
+            </w:tcMar>
+            <w:vAlign w:val="top"/>
+          </w:tcPr>
+          <w:p>
+            <w:pPr>
+              <w:pStyle w:val="TableText"/>
+            </w:pPr>
+            <w:r>
+              <w:rPr>
+                <w:b/>
+                <w:bCs/>
+              </w:rPr>
+              <w:t xml:space="preserve">Applies to</w:t>
+            </w:r>
+          </w:p>
+        </w:tc>
+        <w:tc>
+          <w:tcPr>
+            <w:tcW w:type="dxa" w:w="5360"/>
             <w:tcBorders>
               <w:top w:val="single" w:color="808080" w:sz="4"/>
               <w:left w:val="single" w:color="808080" w:sz="4"/>
@@ -23199,7 +23236,7 @@
         </w:trPr>
         <w:tc>
           <w:tcPr>
-            <w:tcW w:type="dxa" w:w="2600"/>
+            <w:tcW w:type="dxa" w:w="2200"/>
             <w:tcBorders>
               <w:top w:val="single" w:color="808080" w:sz="4"/>
               <w:left w:val="single" w:color="808080" w:sz="4"/>
@@ -23225,27 +23262,53 @@
         </w:tc>
         <w:tc>
           <w:tcPr>
-            <w:tcW w:type="dxa" w:w="6760"/>
-            <w:tcBorders>
-              <w:top w:val="single" w:color="808080" w:sz="4"/>
-              <w:left w:val="single" w:color="808080" w:sz="4"/>
-              <w:bottom w:val="single" w:color="808080" w:sz="4"/>
-              <w:right w:val="single" w:color="808080" w:sz="4"/>
-            </w:tcBorders>
-            <w:tcMar>
-              <w:top w:type="dxa" w:w="60"/>
-              <w:left w:type="dxa" w:w="100"/>
-              <w:bottom w:type="dxa" w:w="60"/>
-              <w:right w:type="dxa" w:w="100"/>
-            </w:tcMar>
-            <w:vAlign w:val="top"/>
-          </w:tcPr>
-          <w:p>
-            <w:pPr>
-              <w:pStyle w:val="TableText"/>
-            </w:pPr>
-            <w:r>
-              <w:t xml:space="preserve">The stage was generated or edited and waits for the user.</w:t>
+            <w:tcW w:type="dxa" w:w="1800"/>
+            <w:tcBorders>
+              <w:top w:val="single" w:color="808080" w:sz="4"/>
+              <w:left w:val="single" w:color="808080" w:sz="4"/>
+              <w:bottom w:val="single" w:color="808080" w:sz="4"/>
+              <w:right w:val="single" w:color="808080" w:sz="4"/>
+            </w:tcBorders>
+            <w:tcMar>
+              <w:top w:type="dxa" w:w="60"/>
+              <w:left w:type="dxa" w:w="100"/>
+              <w:bottom w:type="dxa" w:w="60"/>
+              <w:right w:type="dxa" w:w="100"/>
+            </w:tcMar>
+            <w:vAlign w:val="top"/>
+          </w:tcPr>
+          <w:p>
+            <w:pPr>
+              <w:pStyle w:val="TableText"/>
+            </w:pPr>
+            <w:r>
+              <w:t xml:space="preserve">Run and stage</w:t>
+            </w:r>
+          </w:p>
+        </w:tc>
+        <w:tc>
+          <w:tcPr>
+            <w:tcW w:type="dxa" w:w="5360"/>
+            <w:tcBorders>
+              <w:top w:val="single" w:color="808080" w:sz="4"/>
+              <w:left w:val="single" w:color="808080" w:sz="4"/>
+              <w:bottom w:val="single" w:color="808080" w:sz="4"/>
+              <w:right w:val="single" w:color="808080" w:sz="4"/>
+            </w:tcBorders>
+            <w:tcMar>
+              <w:top w:type="dxa" w:w="60"/>
+              <w:left w:type="dxa" w:w="100"/>
+              <w:bottom w:type="dxa" w:w="60"/>
+              <w:right w:type="dxa" w:w="100"/>
+            </w:tcMar>
+            <w:vAlign w:val="top"/>
+          </w:tcPr>
+          <w:p>
+            <w:pPr>
+              <w:pStyle w:val="TableText"/>
+            </w:pPr>
+            <w:r>
+              <w:t xml:space="preserve">The current stage was generated or edited and waits for the user.</w:t>
             </w:r>
           </w:p>
         </w:tc>
@@ -23256,7 +23319,7 @@
         </w:trPr>
         <w:tc>
           <w:tcPr>
-            <w:tcW w:type="dxa" w:w="2600"/>
+            <w:tcW w:type="dxa" w:w="2200"/>
             <w:tcBorders>
               <w:top w:val="single" w:color="808080" w:sz="4"/>
               <w:left w:val="single" w:color="808080" w:sz="4"/>
@@ -23282,7 +23345,33 @@
         </w:tc>
         <w:tc>
           <w:tcPr>
-            <w:tcW w:type="dxa" w:w="6760"/>
+            <w:tcW w:type="dxa" w:w="1800"/>
+            <w:tcBorders>
+              <w:top w:val="single" w:color="808080" w:sz="4"/>
+              <w:left w:val="single" w:color="808080" w:sz="4"/>
+              <w:bottom w:val="single" w:color="808080" w:sz="4"/>
+              <w:right w:val="single" w:color="808080" w:sz="4"/>
+            </w:tcBorders>
+            <w:tcMar>
+              <w:top w:type="dxa" w:w="60"/>
+              <w:left w:type="dxa" w:w="100"/>
+              <w:bottom w:type="dxa" w:w="60"/>
+              <w:right w:type="dxa" w:w="100"/>
+            </w:tcMar>
+            <w:vAlign w:val="top"/>
+          </w:tcPr>
+          <w:p>
+            <w:pPr>
+              <w:pStyle w:val="TableText"/>
+            </w:pPr>
+            <w:r>
+              <w:t xml:space="preserve">Run and stage</w:t>
+            </w:r>
+          </w:p>
+        </w:tc>
+        <w:tc>
+          <w:tcPr>
+            <w:tcW w:type="dxa" w:w="5360"/>
             <w:tcBorders>
               <w:top w:val="single" w:color="808080" w:sz="4"/>
               <w:left w:val="single" w:color="808080" w:sz="4"/>
@@ -23313,7 +23402,256 @@
         </w:trPr>
         <w:tc>
           <w:tcPr>
-            <w:tcW w:type="dxa" w:w="2600"/>
+            <w:tcW w:type="dxa" w:w="2200"/>
+            <w:tcBorders>
+              <w:top w:val="single" w:color="808080" w:sz="4"/>
+              <w:left w:val="single" w:color="808080" w:sz="4"/>
+              <w:bottom w:val="single" w:color="808080" w:sz="4"/>
+              <w:right w:val="single" w:color="808080" w:sz="4"/>
+            </w:tcBorders>
+            <w:tcMar>
+              <w:top w:type="dxa" w:w="60"/>
+              <w:left w:type="dxa" w:w="100"/>
+              <w:bottom w:type="dxa" w:w="60"/>
+              <w:right w:type="dxa" w:w="100"/>
+            </w:tcMar>
+            <w:vAlign w:val="top"/>
+          </w:tcPr>
+          <w:p>
+            <w:pPr>
+              <w:pStyle w:val="TableText"/>
+            </w:pPr>
+            <w:r>
+              <w:t xml:space="preserve">running</w:t>
+            </w:r>
+          </w:p>
+        </w:tc>
+        <w:tc>
+          <w:tcPr>
+            <w:tcW w:type="dxa" w:w="1800"/>
+            <w:tcBorders>
+              <w:top w:val="single" w:color="808080" w:sz="4"/>
+              <w:left w:val="single" w:color="808080" w:sz="4"/>
+              <w:bottom w:val="single" w:color="808080" w:sz="4"/>
+              <w:right w:val="single" w:color="808080" w:sz="4"/>
+            </w:tcBorders>
+            <w:tcMar>
+              <w:top w:type="dxa" w:w="60"/>
+              <w:left w:type="dxa" w:w="100"/>
+              <w:bottom w:type="dxa" w:w="60"/>
+              <w:right w:type="dxa" w:w="100"/>
+            </w:tcMar>
+            <w:vAlign w:val="top"/>
+          </w:tcPr>
+          <w:p>
+            <w:pPr>
+              <w:pStyle w:val="TableText"/>
+            </w:pPr>
+            <w:r>
+              <w:t xml:space="preserve">Run</w:t>
+            </w:r>
+          </w:p>
+        </w:tc>
+        <w:tc>
+          <w:tcPr>
+            <w:tcW w:type="dxa" w:w="5360"/>
+            <w:tcBorders>
+              <w:top w:val="single" w:color="808080" w:sz="4"/>
+              <w:left w:val="single" w:color="808080" w:sz="4"/>
+              <w:bottom w:val="single" w:color="808080" w:sz="4"/>
+              <w:right w:val="single" w:color="808080" w:sz="4"/>
+            </w:tcBorders>
+            <w:tcMar>
+              <w:top w:type="dxa" w:w="60"/>
+              <w:left w:type="dxa" w:w="100"/>
+              <w:bottom w:type="dxa" w:w="60"/>
+              <w:right w:type="dxa" w:w="100"/>
+            </w:tcMar>
+            <w:vAlign w:val="top"/>
+          </w:tcPr>
+          <w:p>
+            <w:pPr>
+              <w:pStyle w:val="TableText"/>
+            </w:pPr>
+            <w:r>
+              <w:t xml:space="preserve">The next stage is being generated by the selected engine.</w:t>
+            </w:r>
+          </w:p>
+        </w:tc>
+      </w:tr>
+      <w:tr>
+        <w:trPr>
+          <w:cantSplit/>
+        </w:trPr>
+        <w:tc>
+          <w:tcPr>
+            <w:tcW w:type="dxa" w:w="2200"/>
+            <w:tcBorders>
+              <w:top w:val="single" w:color="808080" w:sz="4"/>
+              <w:left w:val="single" w:color="808080" w:sz="4"/>
+              <w:bottom w:val="single" w:color="808080" w:sz="4"/>
+              <w:right w:val="single" w:color="808080" w:sz="4"/>
+            </w:tcBorders>
+            <w:tcMar>
+              <w:top w:type="dxa" w:w="60"/>
+              <w:left w:type="dxa" w:w="100"/>
+              <w:bottom w:type="dxa" w:w="60"/>
+              <w:right w:type="dxa" w:w="100"/>
+            </w:tcMar>
+            <w:vAlign w:val="top"/>
+          </w:tcPr>
+          <w:p>
+            <w:pPr>
+              <w:pStyle w:val="TableText"/>
+            </w:pPr>
+            <w:r>
+              <w:t xml:space="preserve">completed</w:t>
+            </w:r>
+          </w:p>
+        </w:tc>
+        <w:tc>
+          <w:tcPr>
+            <w:tcW w:type="dxa" w:w="1800"/>
+            <w:tcBorders>
+              <w:top w:val="single" w:color="808080" w:sz="4"/>
+              <w:left w:val="single" w:color="808080" w:sz="4"/>
+              <w:bottom w:val="single" w:color="808080" w:sz="4"/>
+              <w:right w:val="single" w:color="808080" w:sz="4"/>
+            </w:tcBorders>
+            <w:tcMar>
+              <w:top w:type="dxa" w:w="60"/>
+              <w:left w:type="dxa" w:w="100"/>
+              <w:bottom w:type="dxa" w:w="60"/>
+              <w:right w:type="dxa" w:w="100"/>
+            </w:tcMar>
+            <w:vAlign w:val="top"/>
+          </w:tcPr>
+          <w:p>
+            <w:pPr>
+              <w:pStyle w:val="TableText"/>
+            </w:pPr>
+            <w:r>
+              <w:t xml:space="preserve">Run</w:t>
+            </w:r>
+          </w:p>
+        </w:tc>
+        <w:tc>
+          <w:tcPr>
+            <w:tcW w:type="dxa" w:w="5360"/>
+            <w:tcBorders>
+              <w:top w:val="single" w:color="808080" w:sz="4"/>
+              <w:left w:val="single" w:color="808080" w:sz="4"/>
+              <w:bottom w:val="single" w:color="808080" w:sz="4"/>
+              <w:right w:val="single" w:color="808080" w:sz="4"/>
+            </w:tcBorders>
+            <w:tcMar>
+              <w:top w:type="dxa" w:w="60"/>
+              <w:left w:type="dxa" w:w="100"/>
+              <w:bottom w:type="dxa" w:w="60"/>
+              <w:right w:type="dxa" w:w="100"/>
+            </w:tcMar>
+            <w:vAlign w:val="top"/>
+          </w:tcPr>
+          <w:p>
+            <w:pPr>
+              <w:pStyle w:val="TableText"/>
+            </w:pPr>
+            <w:r>
+              <w:t xml:space="preserve">The XML stage was approved; the SRS document and diagram are published.</w:t>
+            </w:r>
+          </w:p>
+        </w:tc>
+      </w:tr>
+      <w:tr>
+        <w:trPr>
+          <w:cantSplit/>
+        </w:trPr>
+        <w:tc>
+          <w:tcPr>
+            <w:tcW w:type="dxa" w:w="2200"/>
+            <w:tcBorders>
+              <w:top w:val="single" w:color="808080" w:sz="4"/>
+              <w:left w:val="single" w:color="808080" w:sz="4"/>
+              <w:bottom w:val="single" w:color="808080" w:sz="4"/>
+              <w:right w:val="single" w:color="808080" w:sz="4"/>
+            </w:tcBorders>
+            <w:tcMar>
+              <w:top w:type="dxa" w:w="60"/>
+              <w:left w:type="dxa" w:w="100"/>
+              <w:bottom w:type="dxa" w:w="60"/>
+              <w:right w:type="dxa" w:w="100"/>
+            </w:tcMar>
+            <w:vAlign w:val="top"/>
+          </w:tcPr>
+          <w:p>
+            <w:pPr>
+              <w:pStyle w:val="TableText"/>
+            </w:pPr>
+            <w:r>
+              <w:t xml:space="preserve">failed</w:t>
+            </w:r>
+          </w:p>
+        </w:tc>
+        <w:tc>
+          <w:tcPr>
+            <w:tcW w:type="dxa" w:w="1800"/>
+            <w:tcBorders>
+              <w:top w:val="single" w:color="808080" w:sz="4"/>
+              <w:left w:val="single" w:color="808080" w:sz="4"/>
+              <w:bottom w:val="single" w:color="808080" w:sz="4"/>
+              <w:right w:val="single" w:color="808080" w:sz="4"/>
+            </w:tcBorders>
+            <w:tcMar>
+              <w:top w:type="dxa" w:w="60"/>
+              <w:left w:type="dxa" w:w="100"/>
+              <w:bottom w:type="dxa" w:w="60"/>
+              <w:right w:type="dxa" w:w="100"/>
+            </w:tcMar>
+            <w:vAlign w:val="top"/>
+          </w:tcPr>
+          <w:p>
+            <w:pPr>
+              <w:pStyle w:val="TableText"/>
+            </w:pPr>
+            <w:r>
+              <w:t xml:space="preserve">Run</w:t>
+            </w:r>
+          </w:p>
+        </w:tc>
+        <w:tc>
+          <w:tcPr>
+            <w:tcW w:type="dxa" w:w="5360"/>
+            <w:tcBorders>
+              <w:top w:val="single" w:color="808080" w:sz="4"/>
+              <w:left w:val="single" w:color="808080" w:sz="4"/>
+              <w:bottom w:val="single" w:color="808080" w:sz="4"/>
+              <w:right w:val="single" w:color="808080" w:sz="4"/>
+            </w:tcBorders>
+            <w:tcMar>
+              <w:top w:type="dxa" w:w="60"/>
+              <w:left w:type="dxa" w:w="100"/>
+              <w:bottom w:type="dxa" w:w="60"/>
+              <w:right w:type="dxa" w:w="100"/>
+            </w:tcMar>
+            <w:vAlign w:val="top"/>
+          </w:tcPr>
+          <w:p>
+            <w:pPr>
+              <w:pStyle w:val="TableText"/>
+            </w:pPr>
+            <w:r>
+              <w:t xml:space="preserve">A generation error occurred; the user can fix the input and retry.</w:t>
+            </w:r>
+          </w:p>
+        </w:tc>
+      </w:tr>
+      <w:tr>
+        <w:trPr>
+          <w:cantSplit/>
+        </w:trPr>
+        <w:tc>
+          <w:tcPr>
+            <w:tcW w:type="dxa" w:w="2200"/>
             <w:tcBorders>
               <w:top w:val="single" w:color="808080" w:sz="4"/>
               <w:left w:val="single" w:color="808080" w:sz="4"/>
@@ -23339,27 +23677,53 @@
         </w:tc>
         <w:tc>
           <w:tcPr>
-            <w:tcW w:type="dxa" w:w="6760"/>
-            <w:tcBorders>
-              <w:top w:val="single" w:color="808080" w:sz="4"/>
-              <w:left w:val="single" w:color="808080" w:sz="4"/>
-              <w:bottom w:val="single" w:color="808080" w:sz="4"/>
-              <w:right w:val="single" w:color="808080" w:sz="4"/>
-            </w:tcBorders>
-            <w:tcMar>
-              <w:top w:type="dxa" w:w="60"/>
-              <w:left w:type="dxa" w:w="100"/>
-              <w:bottom w:type="dxa" w:w="60"/>
-              <w:right w:type="dxa" w:w="100"/>
-            </w:tcMar>
-            <w:vAlign w:val="top"/>
-          </w:tcPr>
-          <w:p>
-            <w:pPr>
-              <w:pStyle w:val="TableText"/>
-            </w:pPr>
-            <w:r>
-              <w:t xml:space="preserve">An earlier stage was edited or reopened, so this stage was built from outdated input.</w:t>
+            <w:tcW w:type="dxa" w:w="1800"/>
+            <w:tcBorders>
+              <w:top w:val="single" w:color="808080" w:sz="4"/>
+              <w:left w:val="single" w:color="808080" w:sz="4"/>
+              <w:bottom w:val="single" w:color="808080" w:sz="4"/>
+              <w:right w:val="single" w:color="808080" w:sz="4"/>
+            </w:tcBorders>
+            <w:tcMar>
+              <w:top w:type="dxa" w:w="60"/>
+              <w:left w:type="dxa" w:w="100"/>
+              <w:bottom w:type="dxa" w:w="60"/>
+              <w:right w:type="dxa" w:w="100"/>
+            </w:tcMar>
+            <w:vAlign w:val="top"/>
+          </w:tcPr>
+          <w:p>
+            <w:pPr>
+              <w:pStyle w:val="TableText"/>
+            </w:pPr>
+            <w:r>
+              <w:t xml:space="preserve">Stage</w:t>
+            </w:r>
+          </w:p>
+        </w:tc>
+        <w:tc>
+          <w:tcPr>
+            <w:tcW w:type="dxa" w:w="5360"/>
+            <w:tcBorders>
+              <w:top w:val="single" w:color="808080" w:sz="4"/>
+              <w:left w:val="single" w:color="808080" w:sz="4"/>
+              <w:bottom w:val="single" w:color="808080" w:sz="4"/>
+              <w:right w:val="single" w:color="808080" w:sz="4"/>
+            </w:tcBorders>
+            <w:tcMar>
+              <w:top w:type="dxa" w:w="60"/>
+              <w:left w:type="dxa" w:w="100"/>
+              <w:bottom w:type="dxa" w:w="60"/>
+              <w:right w:type="dxa" w:w="100"/>
+            </w:tcMar>
+            <w:vAlign w:val="top"/>
+          </w:tcPr>
+          <w:p>
+            <w:pPr>
+              <w:pStyle w:val="TableText"/>
+            </w:pPr>
+            <w:r>
+              <w:t xml:space="preserve">An earlier stage was edited or reopened, so this stage must be regenerated.</w:t>
             </w:r>
           </w:p>
         </w:tc>
@@ -23370,7 +23734,7 @@
         <w:pStyle w:val="Caption"/>
       </w:pPr>
       <w:r>
-        <w:t xml:space="preserve">Table 18: Stage revision states</w:t>
+        <w:t xml:space="preserve">Table 18: Pipeline run and stage states</w:t>
       </w:r>
     </w:p>
     <w:p>

</xml_diff>